<commit_message>
Competition materials: add repository link, phone and competition name
</commit_message>
<xml_diff>
--- a/competition/ClaimAI_one-pager.docx
+++ b/competition/ClaimAI_one-pager.docx
@@ -539,7 +539,7 @@
           <w:sz w:val="20"/>
           <w:szCs w:val="20"/>
         </w:rPr>
-        <w:t xml:space="preserve">alibig860@gmail.com</w:t>
+        <w:t xml:space="preserve">alibig860@gmail.com, +7 777 034 79 76</w:t>
       </w:r>
     </w:p>
     <w:p>
@@ -563,7 +563,7 @@
           <w:sz w:val="20"/>
           <w:szCs w:val="20"/>
         </w:rPr>
-        <w:t xml:space="preserve">[ссылка на репозиторий GitHub]   </w:t>
+        <w:t xml:space="preserve">https://github.com/AliDamn/hack   </w:t>
       </w:r>
       <w:r>
         <w:rPr>

</xml_diff>

<commit_message>
Remove demo placeholders from competition materials
</commit_message>
<xml_diff>
--- a/competition/ClaimAI_one-pager.docx
+++ b/competition/ClaimAI_one-pager.docx
@@ -563,26 +563,7 @@
           <w:sz w:val="20"/>
           <w:szCs w:val="20"/>
         </w:rPr>
-        <w:t xml:space="preserve">https://github.com/AliDamn/hack   </w:t>
-      </w:r>
-      <w:r>
-        <w:rPr>
-          <w:rFonts w:ascii="Calibri" w:cs="Calibri" w:eastAsia="Calibri" w:hAnsi="Calibri"/>
-          <w:b/>
-          <w:bCs/>
-          <w:color w:val="0F2740"/>
-          <w:sz w:val="20"/>
-          <w:szCs w:val="20"/>
-        </w:rPr>
-        <w:t xml:space="preserve">Демо: </w:t>
-      </w:r>
-      <w:r>
-        <w:rPr>
-          <w:rFonts w:ascii="Calibri" w:cs="Calibri" w:eastAsia="Calibri" w:hAnsi="Calibri"/>
-          <w:sz w:val="20"/>
-          <w:szCs w:val="20"/>
-        </w:rPr>
-        <w:t xml:space="preserve">[ссылка на работающий прототип]</w:t>
+        <w:t xml:space="preserve">https://github.com/AliDamn/hack</w:t>
       </w:r>
     </w:p>
     <w:sectPr>

</xml_diff>